<commit_message>
Add the caching/minification round to the Project 4 reflection
Covers the third real decision made on this project: PageSpeed
Insights still flagged missing browser caching and unminified CSS/JS
after the accessibility tradeoff was settled, and disclosing both as
deliberate zero-build-step consequences would have been the easier
answer but not necessarily the right one. Documents actually solving
both (versioned cache-busting, and a minify script that generates a
committed twin rather than replacing the hand-edited source) and the
reasoning for why this narrower build-step exception was acceptable
where the earlier Sass pipeline wasn't.
</commit_message>
<xml_diff>
--- a/docs/upload/Project4-Reflection-Anderson.docx
+++ b/docs/upload/Project4-Reflection-Anderson.docx
@@ -94,6 +94,15 @@
           <w:i w:val="0"/>
         </w:rPr>
         <w:t>What I am taking from all of this into future projects is that tools are just that, tools to reach your goal or desired outcome, and not the goal itself. WAVE passing does not mean Lighthouse will pass, Lighthouse passing does not mean the page actually reads well, and neither one of them knows what I am actually trying to build here, which is a hub that is genuinely easy to read given how link-dense it is by design. Both tools are useful precisely because they catch different things, but neither one is the final authority on whether a page serves the person reading it, and when they disagree the decision about which one to listen to is still mine to make and mine to defend afterward, not something I can outsource to whichever tool happens to be stricter. The CSS specificity issue taught me something narrower but just as practical alongside that, which is that a change that reads correctly in the source is not verified until I have actually looked at the thing it was supposed to change, live, in the state a reader would encounter it in. I plan to check the rendered result of a fix before considering it finished on every project after this one, not just when something looks suspicious, and to keep treating every tool on this list, WAVE, Lighthouse, PageSpeed Insights, or anything else, as a means of checking my own judgment rather than a replacement for having any.</w:t>
+      </w:r>
+    </w:p>
+    <w:p>
+      <w:r>
+        <w:rPr>
+          <w:b w:val="0"/>
+          <w:i w:val="0"/>
+        </w:rPr>
+        <w:t>There was a third thing worth writing down, and it came from pushing past what I first thought was good enough. PageSpeed Insights was still flagging two real, specific issues after everything above was settled: no browser caching on the stylesheet and script, and no minification on either one. My first instinct was to disclose both as deliberate tradeoffs of building this site with no compile step at all and leave it there, which is a defensible answer, but it is also the easier answer, and I decided the assignment asked me to actually address what the tool identified, not just explain why I was choosing not to. Caching turned out to be the safer fix: I could give the stylesheet and script a full year of cache life without any real risk, as long as I changed the file name every time I actually edited one of them, since a browser treats a new query string as a completely different file to fetch. Minification was the harder call, because doing it for real meant the file the browser downloads is no longer the exact file I hand-edit, which is the same kind of tradeoff I already made once this term when I dropped a Sass build step for the opposite reason, that it put a compile step between me and seeing my own change. I decided the two situations were not actually the same: the Sass step meant I could not see a change at all without compiling first, while this only means the browser will not see it until I run one script and update a version number, so I wrote a small script that generates a minified copy on demand, kept the original file as the one I actually edit, and wrote both the reasoning and the exact steps directly onto the page a reader of the code would land on. What I am taking from this part is that a disclosed tradeoff is not automatically the finish line just because it is honest. Sometimes the honest answer is genuinely the right one to stop at, and sometimes it is a signal that I found the boundary of what I had already built and stopped looking for a way past it, and the only way to tell the difference is to actually try solving it before deciding which one it was.</w:t>
       </w:r>
     </w:p>
     <w:sectPr>

</xml_diff>

<commit_message>
Disclose AI assistant use for research and code review
Added to about.html's References list and "How the site is built"
section, and to the Project 4 reflection: Claude (Opus and Sonnet
models) and Cursor's Composer and Grok models were used throughout
this project for research and code review.
</commit_message>
<xml_diff>
--- a/docs/upload/Project4-Reflection-Anderson.docx
+++ b/docs/upload/Project4-Reflection-Anderson.docx
@@ -103,6 +103,15 @@
           <w:i w:val="0"/>
         </w:rPr>
         <w:t>There was a third thing worth writing down, and it came from pushing past what I first thought was good enough. PageSpeed Insights was still flagging two real, specific issues after everything above was settled: no browser caching on the stylesheet and script, and no minification on either one. My first instinct was to disclose both as deliberate tradeoffs of building this site with no compile step at all and leave it there, which is a defensible answer, but it is also the easier answer, and I decided the assignment asked me to actually address what the tool identified, not just explain why I was choosing not to. Caching turned out to be the safer fix: I could give the stylesheet and script a full year of cache life without any real risk, as long as I changed the file name every time I actually edited one of them, since a browser treats a new query string as a completely different file to fetch. Minification was the harder call, because doing it for real meant the file the browser downloads is no longer the exact file I hand-edit, which is the same kind of tradeoff I already made once this term when I dropped a Sass build step for the opposite reason, that it put a compile step between me and seeing my own change. I decided the two situations were not actually the same: the Sass step meant I could not see a change at all without compiling first, while this only means the browser will not see it until I run one script and update a version number, so I wrote a small script that generates a minified copy on demand, kept the original file as the one I actually edit, and wrote both the reasoning and the exact steps directly onto the page a reader of the code would land on. What I am taking from this part is that a disclosed tradeoff is not automatically the finish line just because it is honest. Sometimes the honest answer is genuinely the right one to stop at, and sometimes it is a signal that I found the boundary of what I had already built and stopped looking for a way past it, and the only way to tell the difference is to actually try solving it before deciding which one it was.</w:t>
+      </w:r>
+    </w:p>
+    <w:p>
+      <w:r>
+        <w:rPr>
+          <w:b w:val="0"/>
+          <w:i w:val="0"/>
+        </w:rPr>
+        <w:t>AI assistance disclosure: Claude (Opus and Sonnet models) and Cursor's Composer and Grok models were used throughout this project for research and code review.</w:t>
       </w:r>
     </w:p>
     <w:sectPr>

</xml_diff>